<commit_message>
Redesign Barter Hustle for two 12-student markets
</commit_message>
<xml_diff>
--- a/resources/Unit_2_Lesson_2_Vocabulary_and_Bartering.docx
+++ b/resources/Unit_2_Lesson_2_Vocabulary_and_Bartering.docx
@@ -7,602 +7,91 @@
         <w:pStyle w:val="Title"/>
       </w:pPr>
       <w:r>
-        <w:t>Unit 2 Lesson 2</w:t>
+        <w:t>Lesson 2 (Vocabulary Presentation + Bartering Game)</w:t>
+      </w:r>
+    </w:p>
+    <w:p>
+      <w:r>
+        <w:t>B1+  |  40 minutes  |  Up to 24 Ss</w:t>
+      </w:r>
+    </w:p>
+    <w:p>
+      <w:hyperlink r:id="rId9">
+        <w:r>
+          <w:rPr>
+            <w:color w:val="0563C1"/>
+          </w:rPr>
+          <w:t>Unit 2 Vocabulary page</w:t>
+        </w:r>
+      </w:hyperlink>
+    </w:p>
+    <w:p>
+      <w:hyperlink r:id="rId10">
+        <w:r>
+          <w:rPr>
+            <w:color w:val="0563C1"/>
+          </w:rPr>
+          <w:t>Unit 2 Introduction page</w:t>
+        </w:r>
+      </w:hyperlink>
+    </w:p>
+    <w:p>
+      <w:pPr>
+        <w:pStyle w:val="Heading2"/>
+      </w:pPr>
+      <w:r>
+        <w:t>1. Vocabulary Presentation (12 mins)</w:t>
+      </w:r>
+    </w:p>
+    <w:p>
+      <w:r>
+        <w:t>T opens the Unit 2 Vocabulary page and presents today's 10 words: barter, bill, checkout counter, consumer, currency, deal, goods, negotiate, swap and transaction.</w:t>
+      </w:r>
+    </w:p>
+    <w:p>
+      <w:r>
+        <w:t>T shows each photo, checks the meaning and presents one example and one useful phrase. Ss repeat selected words and phrases.</w:t>
+      </w:r>
+    </w:p>
+    <w:p>
+      <w:r>
+        <w:t>T briefly checks the difference between barter, swap, negotiate, deal and transaction.</w:t>
       </w:r>
     </w:p>
     <w:p>
       <w:pPr>
-        <w:pStyle w:val="Subtitle"/>
+        <w:pStyle w:val="Heading2"/>
       </w:pPr>
       <w:r>
-        <w:t>Vocabulary and bartering</w:t>
+        <w:t>2. Memory Links and Sentence Practice (4 mins)</w:t>
       </w:r>
     </w:p>
     <w:p>
       <w:r>
-        <w:t>Level: B1+   |   Class size: up to 24 Ss   |   Duration: 40 minutes</w:t>
+        <w:t>T asks Ss to choose two words and write each word, its short meaning and one personal association.</w:t>
       </w:r>
     </w:p>
     <w:p>
       <w:r>
-        <w:t>T = teacher. Ss = students. The lesson begins with 20 minutes of vocabulary presentation and practice, followed by 20 minutes of Barter Hustle. Ss use the new words to explain both successful and unsuccessful exchanges.</w:t>
+        <w:t>Ss explain one association to a partner and write one example sentence. T circulates and helps.</w:t>
       </w:r>
     </w:p>
     <w:p>
       <w:pPr>
-        <w:pStyle w:val="Heading1"/>
+        <w:pStyle w:val="Heading2"/>
       </w:pPr>
       <w:r>
-        <w:t>Target vocabulary</w:t>
+        <w:t>3. Quick Recall and Transition (4 mins)</w:t>
       </w:r>
     </w:p>
     <w:p>
       <w:r>
-        <w:t>barter · bill · checkout counter · consumer · currency · deal · goods · negotiate · swap · transaction</w:t>
-      </w:r>
-    </w:p>
-    <w:p>
-      <w:pPr>
-        <w:pStyle w:val="Heading1"/>
-      </w:pPr>
-      <w:r>
-        <w:t>Learning aims</w:t>
+        <w:t>T opens Quick recall. Ss discuss the four prompts in pairs before T reveals the answers.</w:t>
       </w:r>
     </w:p>
     <w:p>
       <w:r>
-        <w:t>Ss understand all ten words, use natural phrases to offer and negotiate a swap, and explain how needs and item condition affect an exchange. Ss also consider why money can make transactions easier.</w:t>
-      </w:r>
-    </w:p>
-    <w:p>
-      <w:pPr>
-        <w:pStyle w:val="Heading1"/>
-      </w:pPr>
-      <w:r>
-        <w:t>Lesson timing</w:t>
-      </w:r>
-    </w:p>
-    <w:tbl>
-      <w:tblPr>
-        <w:tblW w:type="auto" w:w="0"/>
-        <w:tblLayout w:type="fixed"/>
-        <w:tblLook w:firstColumn="1" w:firstRow="1" w:lastColumn="0" w:lastRow="0" w:noHBand="0" w:noVBand="1" w:val="04A0"/>
-        <w:tblBorders>
-          <w:top w:val="single" w:sz="4" w:color="D9D9D9"/>
-          <w:bottom w:val="single" w:sz="4" w:color="D9D9D9"/>
-          <w:left w:val="single" w:sz="4" w:color="D9D9D9"/>
-          <w:right w:val="single" w:sz="4" w:color="D9D9D9"/>
-          <w:insideH w:val="single" w:sz="4" w:color="D9D9D9"/>
-          <w:insideV w:val="single" w:sz="4" w:color="D9D9D9"/>
-        </w:tblBorders>
-      </w:tblPr>
-      <w:tblGrid>
-        <w:gridCol w:w="5832"/>
-        <w:gridCol w:w="1656"/>
-        <w:gridCol w:w="2592"/>
-      </w:tblGrid>
-      <w:tr>
-        <w:tc>
-          <w:tcPr>
-            <w:tcW w:type="dxa" w:w="3408"/>
-            <w:shd w:fill="DFEBE5"/>
-            <w:tcMar>
-              <w:top w:w="95" w:type="dxa"/>
-              <w:bottom w:w="95" w:type="dxa"/>
-              <w:left w:w="95" w:type="dxa"/>
-              <w:right w:w="95" w:type="dxa"/>
-            </w:tcMar>
-          </w:tcPr>
-          <w:p>
-            <w:r>
-              <w:rPr>
-                <w:b/>
-              </w:rPr>
-              <w:t>Activity</w:t>
-            </w:r>
-          </w:p>
-        </w:tc>
-        <w:tc>
-          <w:tcPr>
-            <w:tcW w:type="dxa" w:w="3408"/>
-            <w:shd w:fill="DFEBE5"/>
-            <w:tcMar>
-              <w:top w:w="95" w:type="dxa"/>
-              <w:bottom w:w="95" w:type="dxa"/>
-              <w:left w:w="95" w:type="dxa"/>
-              <w:right w:w="95" w:type="dxa"/>
-            </w:tcMar>
-          </w:tcPr>
-          <w:p>
-            <w:r>
-              <w:rPr>
-                <w:b/>
-              </w:rPr>
-              <w:t>Minutes</w:t>
-            </w:r>
-          </w:p>
-        </w:tc>
-        <w:tc>
-          <w:tcPr>
-            <w:tcW w:type="dxa" w:w="3408"/>
-            <w:shd w:fill="DFEBE5"/>
-            <w:tcMar>
-              <w:top w:w="95" w:type="dxa"/>
-              <w:bottom w:w="95" w:type="dxa"/>
-              <w:left w:w="95" w:type="dxa"/>
-              <w:right w:w="95" w:type="dxa"/>
-            </w:tcMar>
-          </w:tcPr>
-          <w:p>
-            <w:r>
-              <w:rPr>
-                <w:b/>
-              </w:rPr>
-              <w:t>Lesson time</w:t>
-            </w:r>
-          </w:p>
-        </w:tc>
-      </w:tr>
-      <w:tr>
-        <w:tc>
-          <w:tcPr>
-            <w:tcW w:type="dxa" w:w="5832"/>
-            <w:vAlign w:val="center"/>
-            <w:tcMar>
-              <w:top w:w="95" w:type="dxa"/>
-              <w:bottom w:w="95" w:type="dxa"/>
-              <w:left w:w="95" w:type="dxa"/>
-              <w:right w:w="95" w:type="dxa"/>
-            </w:tcMar>
-          </w:tcPr>
-          <w:p>
-            <w:pPr>
-              <w:spacing w:after="40"/>
-            </w:pPr>
-            <w:r>
-              <w:t>Vocabulary Presentation</w:t>
-            </w:r>
-          </w:p>
-        </w:tc>
-        <w:tc>
-          <w:tcPr>
-            <w:tcW w:type="dxa" w:w="1656"/>
-            <w:vAlign w:val="center"/>
-            <w:tcMar>
-              <w:top w:w="95" w:type="dxa"/>
-              <w:bottom w:w="95" w:type="dxa"/>
-              <w:left w:w="95" w:type="dxa"/>
-              <w:right w:w="95" w:type="dxa"/>
-            </w:tcMar>
-          </w:tcPr>
-          <w:p>
-            <w:pPr>
-              <w:spacing w:after="40"/>
-            </w:pPr>
-            <w:r>
-              <w:t>12</w:t>
-            </w:r>
-          </w:p>
-        </w:tc>
-        <w:tc>
-          <w:tcPr>
-            <w:tcW w:type="dxa" w:w="2592"/>
-            <w:vAlign w:val="center"/>
-            <w:tcMar>
-              <w:top w:w="95" w:type="dxa"/>
-              <w:bottom w:w="95" w:type="dxa"/>
-              <w:left w:w="95" w:type="dxa"/>
-              <w:right w:w="95" w:type="dxa"/>
-            </w:tcMar>
-          </w:tcPr>
-          <w:p>
-            <w:pPr>
-              <w:spacing w:after="40"/>
-            </w:pPr>
-            <w:r>
-              <w:t>0-12</w:t>
-            </w:r>
-          </w:p>
-        </w:tc>
-      </w:tr>
-      <w:tr>
-        <w:tc>
-          <w:tcPr>
-            <w:tcW w:type="dxa" w:w="5832"/>
-            <w:vAlign w:val="center"/>
-            <w:shd w:fill="F4F7F5"/>
-            <w:tcMar>
-              <w:top w:w="95" w:type="dxa"/>
-              <w:bottom w:w="95" w:type="dxa"/>
-              <w:left w:w="95" w:type="dxa"/>
-              <w:right w:w="95" w:type="dxa"/>
-            </w:tcMar>
-          </w:tcPr>
-          <w:p>
-            <w:pPr>
-              <w:spacing w:after="40"/>
-            </w:pPr>
-            <w:r>
-              <w:t>Personal Memory Links and Useful Chunks</w:t>
-            </w:r>
-          </w:p>
-        </w:tc>
-        <w:tc>
-          <w:tcPr>
-            <w:tcW w:type="dxa" w:w="1656"/>
-            <w:vAlign w:val="center"/>
-            <w:shd w:fill="F4F7F5"/>
-            <w:tcMar>
-              <w:top w:w="95" w:type="dxa"/>
-              <w:bottom w:w="95" w:type="dxa"/>
-              <w:left w:w="95" w:type="dxa"/>
-              <w:right w:w="95" w:type="dxa"/>
-            </w:tcMar>
-          </w:tcPr>
-          <w:p>
-            <w:pPr>
-              <w:spacing w:after="40"/>
-            </w:pPr>
-            <w:r>
-              <w:t>4</w:t>
-            </w:r>
-          </w:p>
-        </w:tc>
-        <w:tc>
-          <w:tcPr>
-            <w:tcW w:type="dxa" w:w="2592"/>
-            <w:vAlign w:val="center"/>
-            <w:shd w:fill="F4F7F5"/>
-            <w:tcMar>
-              <w:top w:w="95" w:type="dxa"/>
-              <w:bottom w:w="95" w:type="dxa"/>
-              <w:left w:w="95" w:type="dxa"/>
-              <w:right w:w="95" w:type="dxa"/>
-            </w:tcMar>
-          </w:tcPr>
-          <w:p>
-            <w:pPr>
-              <w:spacing w:after="40"/>
-            </w:pPr>
-            <w:r>
-              <w:t>12-16</w:t>
-            </w:r>
-          </w:p>
-        </w:tc>
-      </w:tr>
-      <w:tr>
-        <w:tc>
-          <w:tcPr>
-            <w:tcW w:type="dxa" w:w="5832"/>
-            <w:vAlign w:val="center"/>
-            <w:tcMar>
-              <w:top w:w="95" w:type="dxa"/>
-              <w:bottom w:w="95" w:type="dxa"/>
-              <w:left w:w="95" w:type="dxa"/>
-              <w:right w:w="95" w:type="dxa"/>
-            </w:tcMar>
-          </w:tcPr>
-          <w:p>
-            <w:pPr>
-              <w:spacing w:after="40"/>
-            </w:pPr>
-            <w:r>
-              <w:t>Quick Recall and Transition</w:t>
-            </w:r>
-          </w:p>
-        </w:tc>
-        <w:tc>
-          <w:tcPr>
-            <w:tcW w:type="dxa" w:w="1656"/>
-            <w:vAlign w:val="center"/>
-            <w:tcMar>
-              <w:top w:w="95" w:type="dxa"/>
-              <w:bottom w:w="95" w:type="dxa"/>
-              <w:left w:w="95" w:type="dxa"/>
-              <w:right w:w="95" w:type="dxa"/>
-            </w:tcMar>
-          </w:tcPr>
-          <w:p>
-            <w:pPr>
-              <w:spacing w:after="40"/>
-            </w:pPr>
-            <w:r>
-              <w:t>4</w:t>
-            </w:r>
-          </w:p>
-        </w:tc>
-        <w:tc>
-          <w:tcPr>
-            <w:tcW w:type="dxa" w:w="2592"/>
-            <w:vAlign w:val="center"/>
-            <w:tcMar>
-              <w:top w:w="95" w:type="dxa"/>
-              <w:bottom w:w="95" w:type="dxa"/>
-              <w:left w:w="95" w:type="dxa"/>
-              <w:right w:w="95" w:type="dxa"/>
-            </w:tcMar>
-          </w:tcPr>
-          <w:p>
-            <w:pPr>
-              <w:spacing w:after="40"/>
-            </w:pPr>
-            <w:r>
-              <w:t>16-20</w:t>
-            </w:r>
-          </w:p>
-        </w:tc>
-      </w:tr>
-      <w:tr>
-        <w:tc>
-          <w:tcPr>
-            <w:tcW w:type="dxa" w:w="5832"/>
-            <w:vAlign w:val="center"/>
-            <w:shd w:fill="F4F7F5"/>
-            <w:tcMar>
-              <w:top w:w="95" w:type="dxa"/>
-              <w:bottom w:w="95" w:type="dxa"/>
-              <w:left w:w="95" w:type="dxa"/>
-              <w:right w:w="95" w:type="dxa"/>
-            </w:tcMar>
-          </w:tcPr>
-          <w:p>
-            <w:pPr>
-              <w:spacing w:after="40"/>
-            </w:pPr>
-            <w:r>
-              <w:t>Prepare to Barter</w:t>
-            </w:r>
-          </w:p>
-        </w:tc>
-        <w:tc>
-          <w:tcPr>
-            <w:tcW w:type="dxa" w:w="1656"/>
-            <w:vAlign w:val="center"/>
-            <w:shd w:fill="F4F7F5"/>
-            <w:tcMar>
-              <w:top w:w="95" w:type="dxa"/>
-              <w:bottom w:w="95" w:type="dxa"/>
-              <w:left w:w="95" w:type="dxa"/>
-              <w:right w:w="95" w:type="dxa"/>
-            </w:tcMar>
-          </w:tcPr>
-          <w:p>
-            <w:pPr>
-              <w:spacing w:after="40"/>
-            </w:pPr>
-            <w:r>
-              <w:t>5</w:t>
-            </w:r>
-          </w:p>
-        </w:tc>
-        <w:tc>
-          <w:tcPr>
-            <w:tcW w:type="dxa" w:w="2592"/>
-            <w:vAlign w:val="center"/>
-            <w:shd w:fill="F4F7F5"/>
-            <w:tcMar>
-              <w:top w:w="95" w:type="dxa"/>
-              <w:bottom w:w="95" w:type="dxa"/>
-              <w:left w:w="95" w:type="dxa"/>
-              <w:right w:w="95" w:type="dxa"/>
-            </w:tcMar>
-          </w:tcPr>
-          <w:p>
-            <w:pPr>
-              <w:spacing w:after="40"/>
-            </w:pPr>
-            <w:r>
-              <w:t>20-25</w:t>
-            </w:r>
-          </w:p>
-        </w:tc>
-      </w:tr>
-      <w:tr>
-        <w:tc>
-          <w:tcPr>
-            <w:tcW w:type="dxa" w:w="5832"/>
-            <w:vAlign w:val="center"/>
-            <w:tcMar>
-              <w:top w:w="95" w:type="dxa"/>
-              <w:bottom w:w="95" w:type="dxa"/>
-              <w:left w:w="95" w:type="dxa"/>
-              <w:right w:w="95" w:type="dxa"/>
-            </w:tcMar>
-          </w:tcPr>
-          <w:p>
-            <w:pPr>
-              <w:spacing w:after="40"/>
-            </w:pPr>
-            <w:r>
-              <w:t>Barter Hustle Trading Round</w:t>
-            </w:r>
-          </w:p>
-        </w:tc>
-        <w:tc>
-          <w:tcPr>
-            <w:tcW w:type="dxa" w:w="1656"/>
-            <w:vAlign w:val="center"/>
-            <w:tcMar>
-              <w:top w:w="95" w:type="dxa"/>
-              <w:bottom w:w="95" w:type="dxa"/>
-              <w:left w:w="95" w:type="dxa"/>
-              <w:right w:w="95" w:type="dxa"/>
-            </w:tcMar>
-          </w:tcPr>
-          <w:p>
-            <w:pPr>
-              <w:spacing w:after="40"/>
-            </w:pPr>
-            <w:r>
-              <w:t>6</w:t>
-            </w:r>
-          </w:p>
-        </w:tc>
-        <w:tc>
-          <w:tcPr>
-            <w:tcW w:type="dxa" w:w="2592"/>
-            <w:vAlign w:val="center"/>
-            <w:tcMar>
-              <w:top w:w="95" w:type="dxa"/>
-              <w:bottom w:w="95" w:type="dxa"/>
-              <w:left w:w="95" w:type="dxa"/>
-              <w:right w:w="95" w:type="dxa"/>
-            </w:tcMar>
-          </w:tcPr>
-          <w:p>
-            <w:pPr>
-              <w:spacing w:after="40"/>
-            </w:pPr>
-            <w:r>
-              <w:t>25-31</w:t>
-            </w:r>
-          </w:p>
-        </w:tc>
-      </w:tr>
-      <w:tr>
-        <w:tc>
-          <w:tcPr>
-            <w:tcW w:type="dxa" w:w="5832"/>
-            <w:vAlign w:val="center"/>
-            <w:shd w:fill="F4F7F5"/>
-            <w:tcMar>
-              <w:top w:w="95" w:type="dxa"/>
-              <w:bottom w:w="95" w:type="dxa"/>
-              <w:left w:w="95" w:type="dxa"/>
-              <w:right w:w="95" w:type="dxa"/>
-            </w:tcMar>
-          </w:tcPr>
-          <w:p>
-            <w:pPr>
-              <w:spacing w:after="40"/>
-            </w:pPr>
-            <w:r>
-              <w:t>Discuss Successful and Failed Trades</w:t>
-            </w:r>
-          </w:p>
-        </w:tc>
-        <w:tc>
-          <w:tcPr>
-            <w:tcW w:type="dxa" w:w="1656"/>
-            <w:vAlign w:val="center"/>
-            <w:shd w:fill="F4F7F5"/>
-            <w:tcMar>
-              <w:top w:w="95" w:type="dxa"/>
-              <w:bottom w:w="95" w:type="dxa"/>
-              <w:left w:w="95" w:type="dxa"/>
-              <w:right w:w="95" w:type="dxa"/>
-            </w:tcMar>
-          </w:tcPr>
-          <w:p>
-            <w:pPr>
-              <w:spacing w:after="40"/>
-            </w:pPr>
-            <w:r>
-              <w:t>7</w:t>
-            </w:r>
-          </w:p>
-        </w:tc>
-        <w:tc>
-          <w:tcPr>
-            <w:tcW w:type="dxa" w:w="2592"/>
-            <w:vAlign w:val="center"/>
-            <w:shd w:fill="F4F7F5"/>
-            <w:tcMar>
-              <w:top w:w="95" w:type="dxa"/>
-              <w:bottom w:w="95" w:type="dxa"/>
-              <w:left w:w="95" w:type="dxa"/>
-              <w:right w:w="95" w:type="dxa"/>
-            </w:tcMar>
-          </w:tcPr>
-          <w:p>
-            <w:pPr>
-              <w:spacing w:after="40"/>
-            </w:pPr>
-            <w:r>
-              <w:t>31-38</w:t>
-            </w:r>
-          </w:p>
-        </w:tc>
-      </w:tr>
-      <w:tr>
-        <w:tc>
-          <w:tcPr>
-            <w:tcW w:type="dxa" w:w="5832"/>
-            <w:vAlign w:val="center"/>
-            <w:tcMar>
-              <w:top w:w="95" w:type="dxa"/>
-              <w:bottom w:w="95" w:type="dxa"/>
-              <w:left w:w="95" w:type="dxa"/>
-              <w:right w:w="95" w:type="dxa"/>
-            </w:tcMar>
-          </w:tcPr>
-          <w:p>
-            <w:pPr>
-              <w:spacing w:after="40"/>
-            </w:pPr>
-            <w:r>
-              <w:t>Exit Check</w:t>
-            </w:r>
-          </w:p>
-        </w:tc>
-        <w:tc>
-          <w:tcPr>
-            <w:tcW w:type="dxa" w:w="1656"/>
-            <w:vAlign w:val="center"/>
-            <w:tcMar>
-              <w:top w:w="95" w:type="dxa"/>
-              <w:bottom w:w="95" w:type="dxa"/>
-              <w:left w:w="95" w:type="dxa"/>
-              <w:right w:w="95" w:type="dxa"/>
-            </w:tcMar>
-          </w:tcPr>
-          <w:p>
-            <w:pPr>
-              <w:spacing w:after="40"/>
-            </w:pPr>
-            <w:r>
-              <w:t>2</w:t>
-            </w:r>
-          </w:p>
-        </w:tc>
-        <w:tc>
-          <w:tcPr>
-            <w:tcW w:type="dxa" w:w="2592"/>
-            <w:vAlign w:val="center"/>
-            <w:tcMar>
-              <w:top w:w="95" w:type="dxa"/>
-              <w:bottom w:w="95" w:type="dxa"/>
-              <w:left w:w="95" w:type="dxa"/>
-              <w:right w:w="95" w:type="dxa"/>
-            </w:tcMar>
-          </w:tcPr>
-          <w:p>
-            <w:pPr>
-              <w:spacing w:after="40"/>
-            </w:pPr>
-            <w:r>
-              <w:t>38-40</w:t>
-            </w:r>
-          </w:p>
-        </w:tc>
-      </w:tr>
-    </w:tbl>
-    <w:p>
-      <w:pPr>
-        <w:pStyle w:val="Heading1"/>
-      </w:pPr>
-      <w:r>
-        <w:t>Before class</w:t>
-      </w:r>
-    </w:p>
-    <w:p>
-      <w:r>
-        <w:t>T opens Unit 2 Vocabulary Studio and checks its photo cards and pronunciation audio. T prints the six A4 barter-card pages at 100% size, cuts out all 24 cards and shuffles them. Ss need a pen and paper. The game uses pretend items, so no real belongings are exchanged.</w:t>
-      </w:r>
-    </w:p>
-    <w:p>
-      <w:r>
-        <w:t>Pacing: keep input to one example and one chunk per word. Use personal associations for two words only. Save the extra language toolkits and the later vocabulary for another lesson. This keeps the 20-minute vocabulary block achievable for a moderately paced class.</w:t>
+        <w:t>T says: "Now let us try to get what we need without using currency."</w:t>
       </w:r>
     </w:p>
     <w:p>
@@ -615,159 +104,127 @@
         <w:pStyle w:val="Heading1"/>
       </w:pPr>
       <w:r>
-        <w:t>First 20 minutes Vocabulary</w:t>
+        <w:t>Next 20 Minutes - Two-Market Barter Hustle</w:t>
       </w:r>
     </w:p>
     <w:p>
       <w:pPr>
         <w:pStyle w:val="Heading2"/>
-        <w:spacing w:before="240" w:after="120"/>
       </w:pPr>
       <w:r>
-        <w:t>Step 1: Vocabulary Presentation (12 minutes)</w:t>
+        <w:t>4. Prepare the Two Markets (4 mins)</w:t>
       </w:r>
     </w:p>
     <w:p>
-      <w:pPr>
-        <w:pStyle w:val="ListBullet"/>
-      </w:pPr>
       <w:r>
-        <w:t>T opens Vocabulary in Unit 2 Vocabulary Studio and selects Today's 10 words. T says: "First, we will learn ten words. Then we will use them to make a deal."</w:t>
+        <w:t>T divides the class into two equal groups: Market A and Market B. Each market has the same 12 roles. Market A trades only with Market A; Market B trades only with Market B.</w:t>
       </w:r>
     </w:p>
     <w:p>
-      <w:pPr>
-        <w:pStyle w:val="ListBullet"/>
-      </w:pPr>
       <w:r>
-        <w:t>T presents every card in order: barter, bill, checkout counter, consumer, currency, deal, goods, negotiate, swap and transaction. T keeps the later word sets for another lesson.</w:t>
+        <w:t>T gives one colour-coded card to each S. Ss read their starting item, its condition and their final goal.</w:t>
       </w:r>
     </w:p>
     <w:p>
-      <w:pPr>
-        <w:pStyle w:val="ListBullet"/>
-      </w:pPr>
       <w:r>
-        <w:t>T shows the photo, reads the word and checks its meaning: "What can you see? What does this word mean?" Ss give a short answer. T gives the simple definition when needed.</w:t>
+        <w:t>T models one direct swap and explains that Ss may accept a temporary item and trade it again. Ss keep their role card and update the trade record after each transaction.</w:t>
       </w:r>
     </w:p>
     <w:p>
-      <w:pPr>
-        <w:pStyle w:val="ListBullet"/>
-      </w:pPr>
       <w:r>
-        <w:t>T reads one model example and points to one useful chunk on each card. Ss repeat selected words and chunks. T uses the pronunciation button if helpful.</w:t>
-      </w:r>
-    </w:p>
-    <w:p>
-      <w:pPr>
-        <w:pStyle w:val="ListBullet"/>
-      </w:pPr>
-      <w:r>
-        <w:t>T checks the differences briefly: "Barter uses no money. A swap exchanges things. We negotiate to discuss a deal. The deal is the agreement. The transaction is the exchange."</w:t>
-      </w:r>
-    </w:p>
-    <w:p>
-      <w:pPr>
-        <w:pStyle w:val="ListBullet"/>
-      </w:pPr>
-      <w:r>
-        <w:t>T checks bill and currency: "In American English, a bill is a banknote. Currency is the kind of money a country uses." T asks for one example of goods and one example of a consumer.</w:t>
-      </w:r>
-    </w:p>
-    <w:p>
-      <w:pPr>
-        <w:pStyle w:val="ListBullet"/>
-      </w:pPr>
-      <w:r>
-        <w:t>T spends about one minute on each card and uses the remaining time for the short checks. Ss do not copy the full toolkit for all ten words.</w:t>
+        <w:t>T checks: "Can you trade with the other market?" Ss: "No." "Can you trade twice?" Ss: "Yes." "Must you accept an unsuitable item?" Ss: "No."</w:t>
       </w:r>
     </w:p>
     <w:p>
       <w:pPr>
         <w:pStyle w:val="Heading2"/>
-        <w:spacing w:before="240" w:after="120"/>
       </w:pPr>
       <w:r>
-        <w:t>Step 2: Personal Memory Links and Useful Chunks (4 minutes)</w:t>
+        <w:t>5. Bartering Game (6 mins)</w:t>
       </w:r>
     </w:p>
     <w:p>
-      <w:pPr>
-        <w:pStyle w:val="ListBullet"/>
-      </w:pPr>
       <w:r>
-        <w:t>T opens Memory links and says: "Choose two words you want to remember. What do they make you think of?"</w:t>
+        <w:t>T starts the six-minute timer. Ss move only within their own market, explain what they currently have and negotiate.</w:t>
       </w:r>
     </w:p>
     <w:p>
-      <w:pPr>
-        <w:pStyle w:val="ListBullet"/>
-      </w:pPr>
       <w:r>
-        <w:t>Ss note the two words, a short meaning and one personal memory link for each. Ss may write in their notebooks or enter the links on the website.</w:t>
+        <w:t>After a deal, both Ss update their current item. Ss who reach their final goal stop trading; Ss holding a temporary item continue.</w:t>
       </w:r>
     </w:p>
     <w:p>
-      <w:pPr>
-        <w:pStyle w:val="ListBullet"/>
-      </w:pPr>
       <w:r>
-        <w:t>Ss explain one link to a partner: "___ makes me think of ___ because ___." T circulates and helps Ss make the connection clear.</w:t>
-      </w:r>
-    </w:p>
-    <w:p>
-      <w:pPr>
-        <w:pStyle w:val="ListBullet"/>
-      </w:pPr>
-      <w:r>
-        <w:t>T asks Ss to choose one chunk and write one sentence. Ss can use: "Would you like to swap your ___ for my ___?" or "We can negotiate a fair deal." Partners check the meaning.</w:t>
+        <w:t>T circulates and prompts the target language. When the market closes, Ss tick direct deal, chain deal or no deal and complete the reason.</w:t>
       </w:r>
     </w:p>
     <w:p>
       <w:pPr>
         <w:pStyle w:val="Heading2"/>
-        <w:spacing w:before="240" w:after="120"/>
       </w:pPr>
       <w:r>
-        <w:t>Step 3: Quick Recall and Transition (4 minutes)</w:t>
+        <w:t>6. Compare Results in Each Market (2 mins)</w:t>
+      </w:r>
+    </w:p>
+    <w:p>
+      <w:r>
+        <w:t>Market A and Market B count their direct deals, chain deals and unsuccessful trades. One reporter from each market gives the totals.</w:t>
+      </w:r>
+    </w:p>
+    <w:p>
+      <w:r>
+        <w:t>T records the two sets of results for comparison.</w:t>
       </w:r>
     </w:p>
     <w:p>
       <w:pPr>
-        <w:pStyle w:val="ListBullet"/>
+        <w:pStyle w:val="Heading2"/>
       </w:pPr>
       <w:r>
-        <w:t>T opens Quick recall and shows the four prompts. Ss discuss each answer briefly with a partner before T reveals it.</w:t>
+        <w:t>7. Post-game Discussion (6 mins)</w:t>
+      </w:r>
+    </w:p>
+    <w:p>
+      <w:r>
+        <w:t>T asks direct traders: "Why was your transaction easy?" Ss explain that both people wanted each other’s goods.</w:t>
+      </w:r>
+    </w:p>
+    <w:p>
+      <w:r>
+        <w:t>T asks chain traders: "Why did you accept something you did not finally want? How many transactions did you need?"</w:t>
+      </w:r>
+    </w:p>
+    <w:p>
+      <w:r>
+        <w:t>T asks Ss without a deal: "What stopped the trade? Could negotiation solve the problem?" Ss refer to condition and unmet needs.</w:t>
+      </w:r>
+    </w:p>
+    <w:p>
+      <w:r>
+        <w:t>T asks: "If every item had a price and everyone accepted the same currency, which problems would disappear?"</w:t>
+      </w:r>
+    </w:p>
+    <w:p>
+      <w:r>
+        <w:t>Ss discuss and complete: "Bartering can work when ___. Currency makes trade easier because ___." T establishes that currency provides a commonly accepted means of exchange when people’s wants do not match.</w:t>
       </w:r>
     </w:p>
     <w:p>
       <w:pPr>
-        <w:pStyle w:val="ListBullet"/>
+        <w:pStyle w:val="Heading2"/>
       </w:pPr>
       <w:r>
-        <w:t>Ss recall barter, consumer and currency, then explain negotiate, deal and transaction in order. T accepts clear explanations as well as the target words.</w:t>
-      </w:r>
-    </w:p>
-    <w:p>
-      <w:pPr>
-        <w:pStyle w:val="ListBullet"/>
-      </w:pPr>
-      <w:r>
-        <w:t>T asks one final question: "Where do you pay for goods in a shop?" Ss answer: "At the checkout counter." T points to bill if Ss need a payment example.</w:t>
-      </w:r>
-    </w:p>
-    <w:p>
-      <w:pPr>
-        <w:pStyle w:val="ListBullet"/>
-      </w:pPr>
-      <w:r>
-        <w:t>T links the vocabulary to the game: "Now let's try a transaction without money. You will need something another person has. Can you make a fair deal?"</w:t>
+        <w:t>8. Exit Check (2 mins)</w:t>
       </w:r>
     </w:p>
     <w:p>
       <w:r>
-        <w:br w:type="page"/>
+        <w:t>Ss write: "My result was a direct deal / chain deal / no deal because ___."</w:t>
+      </w:r>
+    </w:p>
+    <w:p>
+      <w:r>
+        <w:t>Ss add: "A shared currency helps people because ___." T collects the answers.</w:t>
       </w:r>
     </w:p>
     <w:p>
@@ -775,177 +232,17 @@
         <w:pStyle w:val="Heading1"/>
       </w:pPr>
       <w:r>
-        <w:t>Next 20 minutes Barter Hustle</w:t>
+        <w:t>Teacher key</w:t>
       </w:r>
     </w:p>
     <w:p>
-      <w:pPr>
-        <w:pStyle w:val="Heading2"/>
-        <w:spacing w:before="240" w:after="120"/>
-      </w:pPr>
       <w:r>
-        <w:t>Step 4: Prepare to Barter (5 minutes)</w:t>
+        <w:t>Each market contains the same pattern: Cards 1 and 6 form a direct pair; Cards 4 and 10 form a direct pair; Cards 3, 9 and 12 form a three-person chain; Cards 5, 7 and 11 form a three-person chain; Cards 2 and 8 cannot agree because the power bank is empty and the puzzle is incomplete. Do not reveal this pattern before the game.</w:t>
       </w:r>
     </w:p>
     <w:p>
-      <w:pPr>
-        <w:pStyle w:val="ListBullet"/>
-      </w:pPr>
       <w:r>
-        <w:t>T opens Barter Hustle and gives each student one photo card. T says: "Read what you have, what you want and why. Check your item's condition. Keep your own card."</w:t>
-      </w:r>
-    </w:p>
-    <w:p>
-      <w:pPr>
-        <w:pStyle w:val="ListBullet"/>
-      </w:pPr>
-      <w:r>
-        <w:t>T models an exchange with one student: "Would you like to swap your pen for my notebook?" The student asks: "Is it in good condition?" T replies: "Yes. Can we negotiate a deal?" The student replies: "It's a deal!"</w:t>
-      </w:r>
-    </w:p>
-    <w:p>
-      <w:pPr>
-        <w:pStyle w:val="ListBullet"/>
-      </w:pPr>
-      <w:r>
-        <w:t>Ss practise one offer and one reply with a neighbour. T points to the phrases on the cards and the website.</w:t>
-      </w:r>
-    </w:p>
-    <w:p>
-      <w:pPr>
-        <w:pStyle w:val="ListBullet"/>
-      </w:pPr>
-      <w:r>
-        <w:t>T gives the rules: "Use two phrases and two key words. Both people must agree. You can refuse politely. Be honest about your item. Do not change your card. No real items or money are needed."</w:t>
-      </w:r>
-    </w:p>
-    <w:p>
-      <w:pPr>
-        <w:pStyle w:val="ListBullet"/>
-      </w:pPr>
-      <w:r>
-        <w:t>T checks: "Do you keep your card?" Ss: "Yes." "Must you accept every offer?" Ss: "No." "How long do you have to trade?" Ss: "Six minutes."</w:t>
-      </w:r>
-    </w:p>
-    <w:p>
-      <w:pPr>
-        <w:pStyle w:val="Heading2"/>
-        <w:spacing w:before="240" w:after="120"/>
-      </w:pPr>
-      <w:r>
-        <w:t>Step 5: Barter Hustle Trading Round (6 minutes)</w:t>
-      </w:r>
-    </w:p>
-    <w:p>
-      <w:pPr>
-        <w:pStyle w:val="ListBullet"/>
-      </w:pPr>
-      <w:r>
-        <w:t>T starts the six-minute timer: "Stand up. Ask what other people have and want. Find someone who needs your item and has what you need."</w:t>
-      </w:r>
-    </w:p>
-    <w:p>
-      <w:pPr>
-        <w:pStyle w:val="ListBullet"/>
-      </w:pPr>
-      <w:r>
-        <w:t>Ss mingle, check the condition of items and negotiate. If both Ss agree, they act out the swap, keep their own cards, record what they gave and received, and sit down. Ss who refuse an offer try someone else.</w:t>
-      </w:r>
-    </w:p>
-    <w:p>
-      <w:pPr>
-        <w:pStyle w:val="ListBullet"/>
-      </w:pPr>
-      <w:r>
-        <w:t>T circulates and prompts Ss to use swap, negotiate and deal. T listens for clear reasons and polite replies. T does not force Ss to accept an unsuitable trade.</w:t>
-      </w:r>
-    </w:p>
-    <w:p>
-      <w:pPr>
-        <w:pStyle w:val="ListBullet"/>
-      </w:pPr>
-      <w:r>
-        <w:t>When the market closes, T says: "Sit down. Tick deal or no deal. Write a short reason."</w:t>
-      </w:r>
-    </w:p>
-    <w:p>
-      <w:pPr>
-        <w:pStyle w:val="Heading2"/>
-        <w:spacing w:before="240" w:after="120"/>
-      </w:pPr>
-      <w:r>
-        <w:t>Step 6: Discuss Successful and Failed Trades (7 minutes)</w:t>
-      </w:r>
-    </w:p>
-    <w:p>
-      <w:pPr>
-        <w:pStyle w:val="ListBullet"/>
-      </w:pPr>
-      <w:r>
-        <w:t>T asks: "Who made a deal? Who did not?" Ss show hands. T counts both groups.</w:t>
-      </w:r>
-    </w:p>
-    <w:p>
-      <w:pPr>
-        <w:pStyle w:val="ListBullet"/>
-      </w:pPr>
-      <w:r>
-        <w:t>Ss tell a partner what happened: "We swapped ___ for ___ because ___." or "We tried to negotiate, but ___, so the swap failed."</w:t>
-      </w:r>
-    </w:p>
-    <w:p>
-      <w:pPr>
-        <w:pStyle w:val="ListBullet"/>
-      </w:pPr>
-      <w:r>
-        <w:t>T invites two successful traders and two Ss without a deal to share briefly. T asks: "Did both people get what they needed? What stopped the other trades?"</w:t>
-      </w:r>
-    </w:p>
-    <w:p>
-      <w:pPr>
-        <w:pStyle w:val="ListBullet"/>
-      </w:pPr>
-      <w:r>
-        <w:t>T helps Ss identify different needs, item condition, language or an unfair offer. T says: "A polite refusal can be a good decision. You do not have to make every deal."</w:t>
-      </w:r>
-    </w:p>
-    <w:p>
-      <w:pPr>
-        <w:pStyle w:val="ListBullet"/>
-      </w:pPr>
-      <w:r>
-        <w:t>T asks: "Would money make this transaction easier? Why?" Ss use: "Money makes transactions easier because ___." T returns to the Lesson 1 statement about swapping being more convenient and asks whether Ss have changed their minds.</w:t>
-      </w:r>
-    </w:p>
-    <w:p>
-      <w:pPr>
-        <w:pStyle w:val="Heading2"/>
-        <w:spacing w:before="240" w:after="120"/>
-      </w:pPr>
-      <w:r>
-        <w:t>Step 7: Exit Check (2 minutes)</w:t>
-      </w:r>
-    </w:p>
-    <w:p>
-      <w:pPr>
-        <w:pStyle w:val="ListBullet"/>
-      </w:pPr>
-      <w:r>
-        <w:t>T asks Ss to write two short sentences: "Bartering worked / failed for me because ___." and "Money makes transactions easier because ___."</w:t>
-      </w:r>
-    </w:p>
-    <w:p>
-      <w:pPr>
-        <w:pStyle w:val="ListBullet"/>
-      </w:pPr>
-      <w:r>
-        <w:t>Ss use at least one target word. T collects the answers or reads a few before the lesson ends.</w:t>
-      </w:r>
-    </w:p>
-    <w:p>
-      <w:pPr/>
-      <w:r>
-        <w:t>Teacher note: use complete partner pairs for smaller classes. Possible pairs are 1-2, 3-4, 5-6, 7-8, 9-10, 11-12, 13-14, 15-16, 17-18, 19-20, 21-22 and 23-24. Pairs 7-8, 15-16 and 23-24 include a condition conflict. For an odd class size, two Ss share one role and take turns speaking.</w:t>
+        <w:t>Pacing: use one example and one phrase per vocabulary word. Keep memory links to two words. In the game, stop after six minutes even if a chain is unfinished; incomplete chains provide useful evidence for the discussion.</w:t>
       </w:r>
     </w:p>
     <w:sectPr>
@@ -1322,7 +619,7 @@
     <w:qFormat/>
     <w:rsid w:val="00FC693F"/>
     <w:pPr>
-      <w:spacing w:after="140" w:line="247" w:lineRule="auto"/>
+      <w:spacing w:after="80" w:line="240" w:lineRule="auto"/>
     </w:pPr>
     <w:rPr>
       <w:rFonts w:ascii="Calibri" w:hAnsi="Calibri"/>
@@ -1385,7 +682,7 @@
     <w:pPr>
       <w:keepNext/>
       <w:keepLines/>
-      <w:spacing w:before="480" w:after="140" w:line="247" w:lineRule="auto"/>
+      <w:spacing w:before="480" w:after="80" w:line="240" w:lineRule="auto"/>
       <w:outlineLvl w:val="0"/>
     </w:pPr>
     <w:rPr>
@@ -1393,7 +690,7 @@
       <w:b/>
       <w:bCs/>
       <w:color w:val="000000"/>
-      <w:sz w:val="30"/>
+      <w:sz w:val="28"/>
       <w:szCs w:val="28"/>
     </w:rPr>
   </w:style>
@@ -1409,7 +706,7 @@
     <w:pPr>
       <w:keepNext/>
       <w:keepLines/>
-      <w:spacing w:before="240" w:after="140" w:line="247" w:lineRule="auto"/>
+      <w:spacing w:before="140" w:after="80" w:line="240" w:lineRule="auto"/>
       <w:outlineLvl w:val="1"/>
     </w:pPr>
     <w:rPr>
@@ -1417,7 +714,7 @@
       <w:b/>
       <w:bCs/>
       <w:color w:val="000000"/>
-      <w:sz w:val="26"/>
+      <w:sz w:val="22"/>
       <w:szCs w:val="26"/>
     </w:rPr>
   </w:style>
@@ -1671,15 +968,16 @@
     <w:qFormat/>
     <w:rsid w:val="00FC693F"/>
     <w:pPr>
-      <w:spacing w:after="140" w:line="247" w:lineRule="auto"/>
+      <w:spacing w:after="80" w:line="240" w:lineRule="auto"/>
       <w:contextualSpacing/>
     </w:pPr>
     <w:rPr>
       <w:rFonts w:asciiTheme="majorHAnsi" w:eastAsiaTheme="majorEastAsia" w:hAnsiTheme="majorHAnsi" w:cstheme="majorBidi" w:ascii="Calibri" w:hAnsi="Calibri"/>
+      <w:b/>
       <w:color w:val="000000"/>
       <w:spacing w:val="5"/>
       <w:kern w:val="28"/>
-      <w:sz w:val="48"/>
+      <w:sz w:val="34"/>
       <w:szCs w:val="52"/>
     </w:rPr>
   </w:style>
@@ -1710,15 +1008,14 @@
       <w:numPr>
         <w:ilvl w:val="1"/>
       </w:numPr>
-      <w:spacing w:after="140" w:line="247" w:lineRule="auto"/>
     </w:pPr>
     <w:rPr>
-      <w:rFonts w:asciiTheme="majorHAnsi" w:eastAsiaTheme="majorEastAsia" w:hAnsiTheme="majorHAnsi" w:cstheme="majorBidi" w:ascii="Calibri" w:hAnsi="Calibri"/>
+      <w:rFonts w:asciiTheme="majorHAnsi" w:eastAsiaTheme="majorEastAsia" w:hAnsiTheme="majorHAnsi" w:cstheme="majorBidi"/>
       <w:i/>
       <w:iCs/>
-      <w:color w:val="000000"/>
+      <w:color w:val="4F81BD" w:themeColor="accent1"/>
       <w:spacing w:val="15"/>
-      <w:sz w:val="22"/>
+      <w:sz w:val="24"/>
       <w:szCs w:val="24"/>
     </w:rPr>
   </w:style>
@@ -1854,14 +1151,8 @@
       <w:numPr>
         <w:numId w:val="1"/>
       </w:numPr>
-      <w:spacing w:after="140" w:line="247" w:lineRule="auto"/>
       <w:contextualSpacing/>
     </w:pPr>
-    <w:rPr>
-      <w:rFonts w:ascii="Calibri" w:hAnsi="Calibri"/>
-      <w:color w:val="000000"/>
-      <w:sz w:val="22"/>
-    </w:rPr>
   </w:style>
   <w:style w:type="paragraph" w:styleId="ListBullet2">
     <w:name w:val="List Bullet 2"/>

</xml_diff>